<commit_message>
Dark theme + toggle, citation persistence, retrieval tuning, doc upload, cost figures
- Frontend: dark theme by default + header light/dark toggle (persisted); CSP-safe theme init in bundle
- Persist per-message citations so past/restored answers keep clickable sources
- Fix SSE framing so multi-paragraph answers retain citations
- Retrieval: drop title-only chunks; allow top-ranked doc up to 3 chunks (fixes restricted-data/attendance recall)
- Admin document upload endpoint; two-tier employee/admin API-key auth; conversation history sidebar
- Design doc + deck: real measured cost figures (per-1K, pilot, production); architecture diagram (draw.io/PNG/SVG)
- Dockerfile $PORT bind + healthcheck; .dockerignore excludes deliverable docs

Co-Authored-By: Claude Opus 4.8 <noreply@anthropic.com>
</commit_message>
<xml_diff>
--- a/Meridian_Design_Document.docx
+++ b/Meridian_Design_Document.docx
@@ -6,6 +6,7 @@
       <w:pPr>
         <w:spacing w:before="1200" w:after="40"/>
       </w:pPr>
+      <w:proofErr w:type="spellStart"/>
       <w:r>
         <w:rPr>
           <w:b/>
@@ -16,6 +17,7 @@
         </w:rPr>
         <w:t>DataFactZ</w:t>
       </w:r>
+      <w:proofErr w:type="spellEnd"/>
     </w:p>
     <w:p>
       <w:pPr>
@@ -253,10 +255,9 @@
         <w:rPr>
           <w:noProof/>
         </w:rPr>
-        <w:lastRenderedPageBreak/>
         <w:drawing>
           <wp:inline distT="0" distB="0" distL="0" distR="0" wp14:anchorId="294EAD6E" wp14:editId="294EAD6F">
-            <wp:extent cx="5334000" cy="6048375"/>
+            <wp:extent cx="5334000" cy="3333750"/>
             <wp:effectExtent l="0" t="0" r="0" b="0"/>
             <wp:docPr id="1" name="Picture 1"/>
             <wp:cNvGraphicFramePr>
@@ -281,7 +282,7 @@
                   <pic:spPr bwMode="auto">
                     <a:xfrm>
                       <a:off x="0" y="0"/>
-                      <a:ext cx="5334000" cy="6048375"/>
+                      <a:ext cx="5334000" cy="3333750"/>
                     </a:xfrm>
                     <a:prstGeom prst="rect">
                       <a:avLst/>
@@ -306,7 +307,31 @@
         <w:t xml:space="preserve">Deployment: </w:t>
       </w:r>
       <w:r>
-        <w:t>Docker container (FastAPI serving both the API and the built React frontend from a single origin) on Azure App Service, Linux B1 plan, AI_Training resource group, Central US. Container image built and pushed via Azure Container Registry (meridianragsriramacr).</w:t>
+        <w:t>Docker container (</w:t>
+      </w:r>
+      <w:proofErr w:type="spellStart"/>
+      <w:r>
+        <w:t>FastAPI</w:t>
+      </w:r>
+      <w:proofErr w:type="spellEnd"/>
+      <w:r>
+        <w:t xml:space="preserve"> serving both the API and the built React frontend from a single origin) on Azure App Service, Linux B1 plan, </w:t>
+      </w:r>
+      <w:proofErr w:type="spellStart"/>
+      <w:r>
+        <w:t>AI_Training</w:t>
+      </w:r>
+      <w:proofErr w:type="spellEnd"/>
+      <w:r>
+        <w:t xml:space="preserve"> resource group, Central US. Container image built and pushed via Azure Container Registry (</w:t>
+      </w:r>
+      <w:proofErr w:type="spellStart"/>
+      <w:r>
+        <w:t>meridianragsriramacr</w:t>
+      </w:r>
+      <w:proofErr w:type="spellEnd"/>
+      <w:r>
+        <w:t>).</w:t>
       </w:r>
     </w:p>
     <w:p>
@@ -333,10 +358,61 @@
           <w:b/>
           <w:bCs/>
         </w:rPr>
-        <w:t xml:space="preserve">Why Docker rather than Azure's native Python buildpack (Oryx): </w:t>
-      </w:r>
-      <w:r>
-        <w:t>the native buildpack's build output compresses to a randomized temporary directory at every container start, which is incompatible with a custom gunicorn startup command referencing the application package by name — this surfaced as a ModuleNotFoundError that persisted across five different startup-command strategies (see Section 13, AI Usage Transparency). A Docker image gives a fixed, predictable filesystem layout with no such indirection, and was adopted after the native buildpack path was conclusively ruled out through direct log evidence, not assumption.</w:t>
+        <w:t xml:space="preserve">Why Docker rather than Azure's native Python </w:t>
+      </w:r>
+      <w:proofErr w:type="spellStart"/>
+      <w:r>
+        <w:rPr>
+          <w:b/>
+          <w:bCs/>
+        </w:rPr>
+        <w:t>buildpack</w:t>
+      </w:r>
+      <w:proofErr w:type="spellEnd"/>
+      <w:r>
+        <w:rPr>
+          <w:b/>
+          <w:bCs/>
+        </w:rPr>
+        <w:t xml:space="preserve"> (Oryx): </w:t>
+      </w:r>
+      <w:r>
+        <w:t xml:space="preserve">the native </w:t>
+      </w:r>
+      <w:proofErr w:type="spellStart"/>
+      <w:r>
+        <w:t>buildpack's</w:t>
+      </w:r>
+      <w:proofErr w:type="spellEnd"/>
+      <w:r>
+        <w:t xml:space="preserve"> build output compresses to a randomized temporary directory at every container start, which is incompatible with a custom </w:t>
+      </w:r>
+      <w:proofErr w:type="spellStart"/>
+      <w:r>
+        <w:t>gunicorn</w:t>
+      </w:r>
+      <w:proofErr w:type="spellEnd"/>
+      <w:r>
+        <w:t xml:space="preserve"> startup command referencing the application package by name — this surfaced as a </w:t>
+      </w:r>
+      <w:proofErr w:type="spellStart"/>
+      <w:r>
+        <w:t>ModuleNotFoundError</w:t>
+      </w:r>
+      <w:proofErr w:type="spellEnd"/>
+      <w:r>
+        <w:t xml:space="preserve"> that persisted across five different startup-command strategies (see Section 13, AI Usage Transparency). A Docker image gives a fixed, predictable filesystem layout with no such indirection, and was adopted after the native </w:t>
+      </w:r>
+      <w:proofErr w:type="spellStart"/>
+      <w:r>
+        <w:t>buildpack</w:t>
+      </w:r>
+      <w:proofErr w:type="spellEnd"/>
+      <w:r>
+        <w:t xml:space="preserve"> path was conclusively r</w:t>
+      </w:r>
+      <w:r>
+        <w:t>uled out through direct log evidence, not assumption.</w:t>
       </w:r>
     </w:p>
     <w:p>
@@ -355,6 +431,7 @@
           <w:sz w:val="30"/>
           <w:szCs w:val="30"/>
         </w:rPr>
+        <w:lastRenderedPageBreak/>
         <w:t>3. Components</w:t>
       </w:r>
     </w:p>
@@ -380,12 +457,6 @@
         <w:gridCol w:w="6919"/>
       </w:tblGrid>
       <w:tr>
-        <w:tblPrEx>
-          <w:tblCellMar>
-            <w:top w:w="0" w:type="dxa"/>
-            <w:bottom w:w="0" w:type="dxa"/>
-          </w:tblCellMar>
-        </w:tblPrEx>
         <w:tc>
           <w:tcPr>
             <w:tcW w:w="2431" w:type="dxa"/>
@@ -436,12 +507,6 @@
         </w:tc>
       </w:tr>
       <w:tr>
-        <w:tblPrEx>
-          <w:tblCellMar>
-            <w:top w:w="0" w:type="dxa"/>
-            <w:bottom w:w="0" w:type="dxa"/>
-          </w:tblCellMar>
-        </w:tblPrEx>
         <w:tc>
           <w:tcPr>
             <w:tcW w:w="2431" w:type="dxa"/>
@@ -461,7 +526,6 @@
                 <w:sz w:val="19"/>
                 <w:szCs w:val="19"/>
               </w:rPr>
-              <w:lastRenderedPageBreak/>
               <w:t>ingest.py</w:t>
             </w:r>
           </w:p>
@@ -483,18 +547,44 @@
                 <w:sz w:val="19"/>
                 <w:szCs w:val="19"/>
               </w:rPr>
-              <w:t>Offline pipeline: parses DOCX/PDF/Markdown, chunks structure-aware, embeds via Azure OpenAI, pushes to Azure AI Search, writes chunk metadata to SQLite. Run manually or via /api/v1/documents/reindex and /api/v1/documents/upload.</w:t>
+              <w:t>Offline pipeline: parses DOCX/PDF/Markdown, chunks structure-aware, embeds via Azure OpenAI, pushes to Azure AI Search, writes chunk metadata to SQLite. Run manually or via /</w:t>
+            </w:r>
+            <w:proofErr w:type="spellStart"/>
+            <w:r>
+              <w:rPr>
+                <w:sz w:val="19"/>
+                <w:szCs w:val="19"/>
+              </w:rPr>
+              <w:t>api</w:t>
+            </w:r>
+            <w:proofErr w:type="spellEnd"/>
+            <w:r>
+              <w:rPr>
+                <w:sz w:val="19"/>
+                <w:szCs w:val="19"/>
+              </w:rPr>
+              <w:t>/v1/documents/reindex and /</w:t>
+            </w:r>
+            <w:proofErr w:type="spellStart"/>
+            <w:r>
+              <w:rPr>
+                <w:sz w:val="19"/>
+                <w:szCs w:val="19"/>
+              </w:rPr>
+              <w:t>api</w:t>
+            </w:r>
+            <w:proofErr w:type="spellEnd"/>
+            <w:r>
+              <w:rPr>
+                <w:sz w:val="19"/>
+                <w:szCs w:val="19"/>
+              </w:rPr>
+              <w:t>/v1/documents/upload.</w:t>
             </w:r>
           </w:p>
         </w:tc>
       </w:tr>
       <w:tr>
-        <w:tblPrEx>
-          <w:tblCellMar>
-            <w:top w:w="0" w:type="dxa"/>
-            <w:bottom w:w="0" w:type="dxa"/>
-          </w:tblCellMar>
-        </w:tblPrEx>
         <w:tc>
           <w:tcPr>
             <w:tcW w:w="2431" w:type="dxa"/>
@@ -541,12 +631,6 @@
         </w:tc>
       </w:tr>
       <w:tr>
-        <w:tblPrEx>
-          <w:tblCellMar>
-            <w:top w:w="0" w:type="dxa"/>
-            <w:bottom w:w="0" w:type="dxa"/>
-          </w:tblCellMar>
-        </w:tblPrEx>
         <w:tc>
           <w:tcPr>
             <w:tcW w:w="2431" w:type="dxa"/>
@@ -593,12 +677,6 @@
         </w:tc>
       </w:tr>
       <w:tr>
-        <w:tblPrEx>
-          <w:tblCellMar>
-            <w:top w:w="0" w:type="dxa"/>
-            <w:bottom w:w="0" w:type="dxa"/>
-          </w:tblCellMar>
-        </w:tblPrEx>
         <w:tc>
           <w:tcPr>
             <w:tcW w:w="2431" w:type="dxa"/>
@@ -645,12 +723,6 @@
         </w:tc>
       </w:tr>
       <w:tr>
-        <w:tblPrEx>
-          <w:tblCellMar>
-            <w:top w:w="0" w:type="dxa"/>
-            <w:bottom w:w="0" w:type="dxa"/>
-          </w:tblCellMar>
-        </w:tblPrEx>
         <w:tc>
           <w:tcPr>
             <w:tcW w:w="2431" w:type="dxa"/>
@@ -686,23 +758,26 @@
             </w:tcMar>
           </w:tcPr>
           <w:p>
-            <w:r>
-              <w:rPr>
-                <w:sz w:val="19"/>
-                <w:szCs w:val="19"/>
-              </w:rPr>
-              <w:t>FastAPI routes, two-tier auth dependencies (employee X-API-Key + admin X-Admin-Key), SSE streaming.</w:t>
+            <w:proofErr w:type="spellStart"/>
+            <w:r>
+              <w:rPr>
+                <w:sz w:val="19"/>
+                <w:szCs w:val="19"/>
+              </w:rPr>
+              <w:t>FastAPI</w:t>
+            </w:r>
+            <w:proofErr w:type="spellEnd"/>
+            <w:r>
+              <w:rPr>
+                <w:sz w:val="19"/>
+                <w:szCs w:val="19"/>
+              </w:rPr>
+              <w:t xml:space="preserve"> routes, two-tier auth dependencies (employee X-API-Key + admin X-Admin-Key), SSE streaming.</w:t>
             </w:r>
           </w:p>
         </w:tc>
       </w:tr>
       <w:tr>
-        <w:tblPrEx>
-          <w:tblCellMar>
-            <w:top w:w="0" w:type="dxa"/>
-            <w:bottom w:w="0" w:type="dxa"/>
-          </w:tblCellMar>
-        </w:tblPrEx>
         <w:tc>
           <w:tcPr>
             <w:tcW w:w="2431" w:type="dxa"/>
@@ -722,7 +797,27 @@
                 <w:sz w:val="19"/>
                 <w:szCs w:val="19"/>
               </w:rPr>
-              <w:t>React frontend (src/)</w:t>
+              <w:t>React frontend (</w:t>
+            </w:r>
+            <w:proofErr w:type="spellStart"/>
+            <w:r>
+              <w:rPr>
+                <w:b/>
+                <w:bCs/>
+                <w:sz w:val="19"/>
+                <w:szCs w:val="19"/>
+              </w:rPr>
+              <w:t>src</w:t>
+            </w:r>
+            <w:proofErr w:type="spellEnd"/>
+            <w:r>
+              <w:rPr>
+                <w:b/>
+                <w:bCs/>
+                <w:sz w:val="19"/>
+                <w:szCs w:val="19"/>
+              </w:rPr>
+              <w:t>/)</w:t>
             </w:r>
           </w:p>
         </w:tc>
@@ -798,7 +893,15 @@
         <w:t xml:space="preserve">1. </w:t>
       </w:r>
       <w:r>
-        <w:t>Parse each corpus document (DOCX via python-docx, PDF via pdfplumber, Markdown natively), preserving heading/section structure.</w:t>
+        <w:t xml:space="preserve">Parse each corpus document (DOCX via python-docx, PDF via </w:t>
+      </w:r>
+      <w:proofErr w:type="spellStart"/>
+      <w:r>
+        <w:t>pdfplumber</w:t>
+      </w:r>
+      <w:proofErr w:type="spellEnd"/>
+      <w:r>
+        <w:t>, Markdown natively), preserving heading/section structure.</w:t>
       </w:r>
     </w:p>
     <w:p>
@@ -848,8 +951,13 @@
         </w:rPr>
         <w:t xml:space="preserve">4. </w:t>
       </w:r>
-      <w:r>
-        <w:t>Upsert to Azure AI Search (hybrid index: keyword + HNSW vector field) and write chunk metadata to SQLite.</w:t>
+      <w:proofErr w:type="spellStart"/>
+      <w:r>
+        <w:t>Upsert</w:t>
+      </w:r>
+      <w:proofErr w:type="spellEnd"/>
+      <w:r>
+        <w:t xml:space="preserve"> to Azure AI Search (hybrid index: keyword + HNSW vector field) and write chunk metadata to SQLite.</w:t>
       </w:r>
     </w:p>
     <w:p>
@@ -882,7 +990,15 @@
         <w:t xml:space="preserve">1. </w:t>
       </w:r>
       <w:r>
-        <w:t>Client sends POST /api/v1/chat with X-API-Key header.</w:t>
+        <w:t>Client sends POST /</w:t>
+      </w:r>
+      <w:proofErr w:type="spellStart"/>
+      <w:r>
+        <w:t>api</w:t>
+      </w:r>
+      <w:proofErr w:type="spellEnd"/>
+      <w:r>
+        <w:t>/v1/chat with X-API-Key header.</w:t>
       </w:r>
     </w:p>
     <w:p>
@@ -899,7 +1015,7 @@
         <w:t xml:space="preserve">2. </w:t>
       </w:r>
       <w:r>
-        <w:t>Backend expands the query with a small curated synonym layer for known paraphrase patterns, then runs hybrid retrieval against Azure AI Search, top 5 chunks — with the top-ranked document permitted up to 2 chunks (see Section 10, context-assembly fix).</w:t>
+        <w:t>Backend expands the query with a small curated synonym layer for known paraphrase patterns, then runs hybrid retrieval against Azure AI Search, top 5 chunks — with the top-ranked document permitted up to 3 chunks (see Section 10, context-assembly fix).</w:t>
       </w:r>
     </w:p>
     <w:p>
@@ -933,7 +1049,15 @@
         <w:t xml:space="preserve">4. </w:t>
       </w:r>
       <w:r>
-        <w:t>If passing, retrieved chunks are wrapped in &lt;retrieved_context&gt; tags with a hardened system prompt instructing the model to treat them as untrusted and never follow embedded instructions. Conversation history (last 3 turns verbatim, older turns as one-line summaries) is included.</w:t>
+        <w:t>If passing, retrieved chunks are wrapped in &lt;</w:t>
+      </w:r>
+      <w:proofErr w:type="spellStart"/>
+      <w:r>
+        <w:t>retrieved_context</w:t>
+      </w:r>
+      <w:proofErr w:type="spellEnd"/>
+      <w:r>
+        <w:t>&gt; tags with a hardened system prompt instructing the model to treat them as untrusted and never follow embedded instructions. Conversation history (last 3 turns verbatim, older turns as one-line summaries) is included.</w:t>
       </w:r>
     </w:p>
     <w:p>
@@ -950,7 +1074,15 @@
         <w:t xml:space="preserve">5. </w:t>
       </w:r>
       <w:r>
-        <w:t>GPT-5.5 generates a response, ending with a &lt;used_chunks&gt; marker listing which retrieved chunk indexes it actually relied on.</w:t>
+        <w:t>GPT-5.5 generates a response, ending with a &lt;</w:t>
+      </w:r>
+      <w:proofErr w:type="spellStart"/>
+      <w:r>
+        <w:t>used_chunks</w:t>
+      </w:r>
+      <w:proofErr w:type="spellEnd"/>
+      <w:r>
+        <w:t>&gt; marker listing which retrieved chunk indexes it actually relied on.</w:t>
       </w:r>
     </w:p>
     <w:p>
@@ -1028,12 +1160,6 @@
         <w:gridCol w:w="7293"/>
       </w:tblGrid>
       <w:tr>
-        <w:tblPrEx>
-          <w:tblCellMar>
-            <w:top w:w="0" w:type="dxa"/>
-            <w:bottom w:w="0" w:type="dxa"/>
-          </w:tblCellMar>
-        </w:tblPrEx>
         <w:tc>
           <w:tcPr>
             <w:tcW w:w="2057" w:type="dxa"/>
@@ -1084,12 +1210,6 @@
         </w:tc>
       </w:tr>
       <w:tr>
-        <w:tblPrEx>
-          <w:tblCellMar>
-            <w:top w:w="0" w:type="dxa"/>
-            <w:bottom w:w="0" w:type="dxa"/>
-          </w:tblCellMar>
-        </w:tblPrEx>
         <w:tc>
           <w:tcPr>
             <w:tcW w:w="2057" w:type="dxa"/>
@@ -1109,6 +1229,7 @@
                 <w:sz w:val="19"/>
                 <w:szCs w:val="19"/>
               </w:rPr>
+              <w:lastRenderedPageBreak/>
               <w:t>documents</w:t>
             </w:r>
           </w:p>
@@ -1130,18 +1251,21 @@
                 <w:sz w:val="19"/>
                 <w:szCs w:val="19"/>
               </w:rPr>
-              <w:t>id (PK) · filename (UNIQUE) · format · chunk_count</w:t>
-            </w:r>
+              <w:t xml:space="preserve">id (PK) · filename (UNIQUE) · format · </w:t>
+            </w:r>
+            <w:proofErr w:type="spellStart"/>
+            <w:r>
+              <w:rPr>
+                <w:sz w:val="19"/>
+                <w:szCs w:val="19"/>
+              </w:rPr>
+              <w:t>chunk_count</w:t>
+            </w:r>
+            <w:proofErr w:type="spellEnd"/>
           </w:p>
         </w:tc>
       </w:tr>
       <w:tr>
-        <w:tblPrEx>
-          <w:tblCellMar>
-            <w:top w:w="0" w:type="dxa"/>
-            <w:bottom w:w="0" w:type="dxa"/>
-          </w:tblCellMar>
-        </w:tblPrEx>
         <w:tc>
           <w:tcPr>
             <w:tcW w:w="2057" w:type="dxa"/>
@@ -1182,18 +1306,60 @@
                 <w:sz w:val="19"/>
                 <w:szCs w:val="19"/>
               </w:rPr>
-              <w:t>id (PK, TEXT) · document_id (FK → documents.id) · section_title · chunk_index · text</w:t>
+              <w:t xml:space="preserve">id (PK, TEXT) · </w:t>
+            </w:r>
+            <w:proofErr w:type="spellStart"/>
+            <w:r>
+              <w:rPr>
+                <w:sz w:val="19"/>
+                <w:szCs w:val="19"/>
+              </w:rPr>
+              <w:t>document_id</w:t>
+            </w:r>
+            <w:proofErr w:type="spellEnd"/>
+            <w:r>
+              <w:rPr>
+                <w:sz w:val="19"/>
+                <w:szCs w:val="19"/>
+              </w:rPr>
+              <w:t xml:space="preserve"> (FK → documents.id) · </w:t>
+            </w:r>
+            <w:proofErr w:type="spellStart"/>
+            <w:r>
+              <w:rPr>
+                <w:sz w:val="19"/>
+                <w:szCs w:val="19"/>
+              </w:rPr>
+              <w:t>section_title</w:t>
+            </w:r>
+            <w:proofErr w:type="spellEnd"/>
+            <w:r>
+              <w:rPr>
+                <w:sz w:val="19"/>
+                <w:szCs w:val="19"/>
+              </w:rPr>
+              <w:t xml:space="preserve"> · </w:t>
+            </w:r>
+            <w:proofErr w:type="spellStart"/>
+            <w:r>
+              <w:rPr>
+                <w:sz w:val="19"/>
+                <w:szCs w:val="19"/>
+              </w:rPr>
+              <w:t>chunk_index</w:t>
+            </w:r>
+            <w:proofErr w:type="spellEnd"/>
+            <w:r>
+              <w:rPr>
+                <w:sz w:val="19"/>
+                <w:szCs w:val="19"/>
+              </w:rPr>
+              <w:t xml:space="preserve"> · text</w:t>
             </w:r>
           </w:p>
         </w:tc>
       </w:tr>
       <w:tr>
-        <w:tblPrEx>
-          <w:tblCellMar>
-            <w:top w:w="0" w:type="dxa"/>
-            <w:bottom w:w="0" w:type="dxa"/>
-          </w:tblCellMar>
-        </w:tblPrEx>
         <w:tc>
           <w:tcPr>
             <w:tcW w:w="2057" w:type="dxa"/>
@@ -1234,18 +1400,37 @@
                 <w:sz w:val="19"/>
                 <w:szCs w:val="19"/>
               </w:rPr>
-              <w:t>id (PK, TEXT) · created_at · updated_at</w:t>
-            </w:r>
+              <w:t xml:space="preserve">id (PK, TEXT) · </w:t>
+            </w:r>
+            <w:proofErr w:type="spellStart"/>
+            <w:r>
+              <w:rPr>
+                <w:sz w:val="19"/>
+                <w:szCs w:val="19"/>
+              </w:rPr>
+              <w:t>created_at</w:t>
+            </w:r>
+            <w:proofErr w:type="spellEnd"/>
+            <w:r>
+              <w:rPr>
+                <w:sz w:val="19"/>
+                <w:szCs w:val="19"/>
+              </w:rPr>
+              <w:t xml:space="preserve"> · </w:t>
+            </w:r>
+            <w:proofErr w:type="spellStart"/>
+            <w:r>
+              <w:rPr>
+                <w:sz w:val="19"/>
+                <w:szCs w:val="19"/>
+              </w:rPr>
+              <w:t>updated_at</w:t>
+            </w:r>
+            <w:proofErr w:type="spellEnd"/>
           </w:p>
         </w:tc>
       </w:tr>
       <w:tr>
-        <w:tblPrEx>
-          <w:tblCellMar>
-            <w:top w:w="0" w:type="dxa"/>
-            <w:bottom w:w="0" w:type="dxa"/>
-          </w:tblCellMar>
-        </w:tblPrEx>
         <w:tc>
           <w:tcPr>
             <w:tcW w:w="2057" w:type="dxa"/>
@@ -1265,7 +1450,6 @@
                 <w:sz w:val="19"/>
                 <w:szCs w:val="19"/>
               </w:rPr>
-              <w:lastRenderedPageBreak/>
               <w:t>messages</w:t>
             </w:r>
           </w:p>
@@ -1287,18 +1471,37 @@
                 <w:sz w:val="19"/>
                 <w:szCs w:val="19"/>
               </w:rPr>
-              <w:t>id (PK, TEXT) · conversation_id (FK → conversations.id) · role (CHECK: user/assistant) · content · created_at</w:t>
-            </w:r>
+              <w:t xml:space="preserve">id (PK, TEXT) · </w:t>
+            </w:r>
+            <w:proofErr w:type="spellStart"/>
+            <w:r>
+              <w:rPr>
+                <w:sz w:val="19"/>
+                <w:szCs w:val="19"/>
+              </w:rPr>
+              <w:t>conversation_id</w:t>
+            </w:r>
+            <w:proofErr w:type="spellEnd"/>
+            <w:r>
+              <w:rPr>
+                <w:sz w:val="19"/>
+                <w:szCs w:val="19"/>
+              </w:rPr>
+              <w:t xml:space="preserve"> (FK → conversations.id) · role (CHECK: user/assistant) · content · </w:t>
+            </w:r>
+            <w:proofErr w:type="spellStart"/>
+            <w:r>
+              <w:rPr>
+                <w:sz w:val="19"/>
+                <w:szCs w:val="19"/>
+              </w:rPr>
+              <w:t>created_at</w:t>
+            </w:r>
+            <w:proofErr w:type="spellEnd"/>
           </w:p>
         </w:tc>
       </w:tr>
       <w:tr>
-        <w:tblPrEx>
-          <w:tblCellMar>
-            <w:top w:w="0" w:type="dxa"/>
-            <w:bottom w:w="0" w:type="dxa"/>
-          </w:tblCellMar>
-        </w:tblPrEx>
         <w:tc>
           <w:tcPr>
             <w:tcW w:w="2057" w:type="dxa"/>
@@ -1339,8 +1542,49 @@
                 <w:sz w:val="19"/>
                 <w:szCs w:val="19"/>
               </w:rPr>
-              <w:t>id (PK, TEXT) · conversation_id (FK → conversations.id) · message_content · rating (CHECK: up/down) · note · created_at</w:t>
-            </w:r>
+              <w:t xml:space="preserve">id (PK, TEXT) · </w:t>
+            </w:r>
+            <w:proofErr w:type="spellStart"/>
+            <w:r>
+              <w:rPr>
+                <w:sz w:val="19"/>
+                <w:szCs w:val="19"/>
+              </w:rPr>
+              <w:t>conversation_id</w:t>
+            </w:r>
+            <w:proofErr w:type="spellEnd"/>
+            <w:r>
+              <w:rPr>
+                <w:sz w:val="19"/>
+                <w:szCs w:val="19"/>
+              </w:rPr>
+              <w:t xml:space="preserve"> (FK → conversations.id) · </w:t>
+            </w:r>
+            <w:proofErr w:type="spellStart"/>
+            <w:r>
+              <w:rPr>
+                <w:sz w:val="19"/>
+                <w:szCs w:val="19"/>
+              </w:rPr>
+              <w:t>message_content</w:t>
+            </w:r>
+            <w:proofErr w:type="spellEnd"/>
+            <w:r>
+              <w:rPr>
+                <w:sz w:val="19"/>
+                <w:szCs w:val="19"/>
+              </w:rPr>
+              <w:t xml:space="preserve"> · rating (CHECK: up/down) · note · </w:t>
+            </w:r>
+            <w:proofErr w:type="spellStart"/>
+            <w:r>
+              <w:rPr>
+                <w:sz w:val="19"/>
+                <w:szCs w:val="19"/>
+              </w:rPr>
+              <w:t>created_at</w:t>
+            </w:r>
+            <w:proofErr w:type="spellEnd"/>
           </w:p>
         </w:tc>
       </w:tr>
@@ -1385,7 +1629,23 @@
         <w:spacing w:after="160"/>
       </w:pPr>
       <w:r>
-        <w:t>All routes under /api/v1, versioned, Pydantic request/response models throughout. Two-tier authentication: employee routes (chat, conversation history, citations, feedback) require the X-API-Key header; admin routes (document list, re-index) require a separate X-Admin-Key header; /health is unauthenticated.</w:t>
+        <w:t>All routes under /</w:t>
+      </w:r>
+      <w:proofErr w:type="spellStart"/>
+      <w:r>
+        <w:t>api</w:t>
+      </w:r>
+      <w:proofErr w:type="spellEnd"/>
+      <w:r>
+        <w:t xml:space="preserve">/v1, versioned, </w:t>
+      </w:r>
+      <w:proofErr w:type="spellStart"/>
+      <w:r>
+        <w:t>Pydantic</w:t>
+      </w:r>
+      <w:proofErr w:type="spellEnd"/>
+      <w:r>
+        <w:t xml:space="preserve"> request/response models throughout. Two-tier authentication: employee routes (chat, conversation history, citations, feedback) require the X-API-Key header; admin routes (document list, re-index) require a separate X-Admin-Key header; /health is unauthenticated.</w:t>
       </w:r>
     </w:p>
     <w:tbl>
@@ -1411,12 +1671,6 @@
         <w:gridCol w:w="4675"/>
       </w:tblGrid>
       <w:tr>
-        <w:tblPrEx>
-          <w:tblCellMar>
-            <w:top w:w="0" w:type="dxa"/>
-            <w:bottom w:w="0" w:type="dxa"/>
-          </w:tblCellMar>
-        </w:tblPrEx>
         <w:tc>
           <w:tcPr>
             <w:tcW w:w="1122" w:type="dxa"/>
@@ -1491,12 +1745,6 @@
         </w:tc>
       </w:tr>
       <w:tr>
-        <w:tblPrEx>
-          <w:tblCellMar>
-            <w:top w:w="0" w:type="dxa"/>
-            <w:bottom w:w="0" w:type="dxa"/>
-          </w:tblCellMar>
-        </w:tblPrEx>
         <w:tc>
           <w:tcPr>
             <w:tcW w:w="1122" w:type="dxa"/>
@@ -1562,12 +1810,6 @@
         </w:tc>
       </w:tr>
       <w:tr>
-        <w:tblPrEx>
-          <w:tblCellMar>
-            <w:top w:w="0" w:type="dxa"/>
-            <w:bottom w:w="0" w:type="dxa"/>
-          </w:tblCellMar>
-        </w:tblPrEx>
         <w:tc>
           <w:tcPr>
             <w:tcW w:w="1122" w:type="dxa"/>
@@ -1606,7 +1848,23 @@
                 <w:sz w:val="19"/>
                 <w:szCs w:val="19"/>
               </w:rPr>
-              <w:t>/api/v1/chat</w:t>
+              <w:t>/</w:t>
+            </w:r>
+            <w:proofErr w:type="spellStart"/>
+            <w:r>
+              <w:rPr>
+                <w:sz w:val="19"/>
+                <w:szCs w:val="19"/>
+              </w:rPr>
+              <w:t>api</w:t>
+            </w:r>
+            <w:proofErr w:type="spellEnd"/>
+            <w:r>
+              <w:rPr>
+                <w:sz w:val="19"/>
+                <w:szCs w:val="19"/>
+              </w:rPr>
+              <w:t>/v1/chat</w:t>
             </w:r>
           </w:p>
         </w:tc>
@@ -1633,12 +1891,6 @@
         </w:tc>
       </w:tr>
       <w:tr>
-        <w:tblPrEx>
-          <w:tblCellMar>
-            <w:top w:w="0" w:type="dxa"/>
-            <w:bottom w:w="0" w:type="dxa"/>
-          </w:tblCellMar>
-        </w:tblPrEx>
         <w:tc>
           <w:tcPr>
             <w:tcW w:w="1122" w:type="dxa"/>
@@ -1677,7 +1929,23 @@
                 <w:sz w:val="19"/>
                 <w:szCs w:val="19"/>
               </w:rPr>
-              <w:t>/api/v1/documents</w:t>
+              <w:t>/</w:t>
+            </w:r>
+            <w:proofErr w:type="spellStart"/>
+            <w:r>
+              <w:rPr>
+                <w:sz w:val="19"/>
+                <w:szCs w:val="19"/>
+              </w:rPr>
+              <w:t>api</w:t>
+            </w:r>
+            <w:proofErr w:type="spellEnd"/>
+            <w:r>
+              <w:rPr>
+                <w:sz w:val="19"/>
+                <w:szCs w:val="19"/>
+              </w:rPr>
+              <w:t>/v1/documents</w:t>
             </w:r>
           </w:p>
         </w:tc>
@@ -1704,12 +1972,6 @@
         </w:tc>
       </w:tr>
       <w:tr>
-        <w:tblPrEx>
-          <w:tblCellMar>
-            <w:top w:w="0" w:type="dxa"/>
-            <w:bottom w:w="0" w:type="dxa"/>
-          </w:tblCellMar>
-        </w:tblPrEx>
         <w:tc>
           <w:tcPr>
             <w:tcW w:w="1122" w:type="dxa"/>
@@ -1748,7 +2010,23 @@
                 <w:sz w:val="19"/>
                 <w:szCs w:val="19"/>
               </w:rPr>
-              <w:t>/api/v1/documents/reindex</w:t>
+              <w:t>/</w:t>
+            </w:r>
+            <w:proofErr w:type="spellStart"/>
+            <w:r>
+              <w:rPr>
+                <w:sz w:val="19"/>
+                <w:szCs w:val="19"/>
+              </w:rPr>
+              <w:t>api</w:t>
+            </w:r>
+            <w:proofErr w:type="spellEnd"/>
+            <w:r>
+              <w:rPr>
+                <w:sz w:val="19"/>
+                <w:szCs w:val="19"/>
+              </w:rPr>
+              <w:t>/v1/documents/reindex</w:t>
             </w:r>
           </w:p>
         </w:tc>
@@ -1775,12 +2053,6 @@
         </w:tc>
       </w:tr>
       <w:tr>
-        <w:tblPrEx>
-          <w:tblCellMar>
-            <w:top w:w="0" w:type="dxa"/>
-            <w:bottom w:w="0" w:type="dxa"/>
-          </w:tblCellMar>
-        </w:tblPrEx>
         <w:tc>
           <w:tcPr>
             <w:tcW w:w="1122" w:type="dxa"/>
@@ -1819,7 +2091,23 @@
                 <w:sz w:val="19"/>
                 <w:szCs w:val="19"/>
               </w:rPr>
-              <w:t>/api/v1/documents/upload</w:t>
+              <w:t>/</w:t>
+            </w:r>
+            <w:proofErr w:type="spellStart"/>
+            <w:r>
+              <w:rPr>
+                <w:sz w:val="19"/>
+                <w:szCs w:val="19"/>
+              </w:rPr>
+              <w:t>api</w:t>
+            </w:r>
+            <w:proofErr w:type="spellEnd"/>
+            <w:r>
+              <w:rPr>
+                <w:sz w:val="19"/>
+                <w:szCs w:val="19"/>
+              </w:rPr>
+              <w:t>/v1/documents/upload</w:t>
             </w:r>
           </w:p>
         </w:tc>
@@ -1846,12 +2134,6 @@
         </w:tc>
       </w:tr>
       <w:tr>
-        <w:tblPrEx>
-          <w:tblCellMar>
-            <w:top w:w="0" w:type="dxa"/>
-            <w:bottom w:w="0" w:type="dxa"/>
-          </w:tblCellMar>
-        </w:tblPrEx>
         <w:tc>
           <w:tcPr>
             <w:tcW w:w="1122" w:type="dxa"/>
@@ -1890,7 +2172,39 @@
                 <w:sz w:val="19"/>
                 <w:szCs w:val="19"/>
               </w:rPr>
-              <w:t>/api/v1/citations/{chunk_id}</w:t>
+              <w:t>/</w:t>
+            </w:r>
+            <w:proofErr w:type="spellStart"/>
+            <w:r>
+              <w:rPr>
+                <w:sz w:val="19"/>
+                <w:szCs w:val="19"/>
+              </w:rPr>
+              <w:t>api</w:t>
+            </w:r>
+            <w:proofErr w:type="spellEnd"/>
+            <w:r>
+              <w:rPr>
+                <w:sz w:val="19"/>
+                <w:szCs w:val="19"/>
+              </w:rPr>
+              <w:t>/v1/citations/{</w:t>
+            </w:r>
+            <w:proofErr w:type="spellStart"/>
+            <w:r>
+              <w:rPr>
+                <w:sz w:val="19"/>
+                <w:szCs w:val="19"/>
+              </w:rPr>
+              <w:t>chunk_id</w:t>
+            </w:r>
+            <w:proofErr w:type="spellEnd"/>
+            <w:r>
+              <w:rPr>
+                <w:sz w:val="19"/>
+                <w:szCs w:val="19"/>
+              </w:rPr>
+              <w:t>}</w:t>
             </w:r>
           </w:p>
         </w:tc>
@@ -1917,12 +2231,6 @@
         </w:tc>
       </w:tr>
       <w:tr>
-        <w:tblPrEx>
-          <w:tblCellMar>
-            <w:top w:w="0" w:type="dxa"/>
-            <w:bottom w:w="0" w:type="dxa"/>
-          </w:tblCellMar>
-        </w:tblPrEx>
         <w:tc>
           <w:tcPr>
             <w:tcW w:w="1122" w:type="dxa"/>
@@ -1961,7 +2269,23 @@
                 <w:sz w:val="19"/>
                 <w:szCs w:val="19"/>
               </w:rPr>
-              <w:t>/api/v1/conversations</w:t>
+              <w:t>/</w:t>
+            </w:r>
+            <w:proofErr w:type="spellStart"/>
+            <w:r>
+              <w:rPr>
+                <w:sz w:val="19"/>
+                <w:szCs w:val="19"/>
+              </w:rPr>
+              <w:t>api</w:t>
+            </w:r>
+            <w:proofErr w:type="spellEnd"/>
+            <w:r>
+              <w:rPr>
+                <w:sz w:val="19"/>
+                <w:szCs w:val="19"/>
+              </w:rPr>
+              <w:t>/v1/conversations</w:t>
             </w:r>
           </w:p>
         </w:tc>
@@ -1988,12 +2312,6 @@
         </w:tc>
       </w:tr>
       <w:tr>
-        <w:tblPrEx>
-          <w:tblCellMar>
-            <w:top w:w="0" w:type="dxa"/>
-            <w:bottom w:w="0" w:type="dxa"/>
-          </w:tblCellMar>
-        </w:tblPrEx>
         <w:tc>
           <w:tcPr>
             <w:tcW w:w="1122" w:type="dxa"/>
@@ -2032,7 +2350,23 @@
                 <w:sz w:val="19"/>
                 <w:szCs w:val="19"/>
               </w:rPr>
-              <w:t>/api/v1/conversations/{id}/messages</w:t>
+              <w:t>/</w:t>
+            </w:r>
+            <w:proofErr w:type="spellStart"/>
+            <w:r>
+              <w:rPr>
+                <w:sz w:val="19"/>
+                <w:szCs w:val="19"/>
+              </w:rPr>
+              <w:t>api</w:t>
+            </w:r>
+            <w:proofErr w:type="spellEnd"/>
+            <w:r>
+              <w:rPr>
+                <w:sz w:val="19"/>
+                <w:szCs w:val="19"/>
+              </w:rPr>
+              <w:t>/v1/conversations/{id}/messages</w:t>
             </w:r>
           </w:p>
         </w:tc>
@@ -2059,12 +2393,6 @@
         </w:tc>
       </w:tr>
       <w:tr>
-        <w:tblPrEx>
-          <w:tblCellMar>
-            <w:top w:w="0" w:type="dxa"/>
-            <w:bottom w:w="0" w:type="dxa"/>
-          </w:tblCellMar>
-        </w:tblPrEx>
         <w:tc>
           <w:tcPr>
             <w:tcW w:w="1122" w:type="dxa"/>
@@ -2103,7 +2431,23 @@
                 <w:sz w:val="19"/>
                 <w:szCs w:val="19"/>
               </w:rPr>
-              <w:t>/api/v1/feedback</w:t>
+              <w:t>/</w:t>
+            </w:r>
+            <w:proofErr w:type="spellStart"/>
+            <w:r>
+              <w:rPr>
+                <w:sz w:val="19"/>
+                <w:szCs w:val="19"/>
+              </w:rPr>
+              <w:t>api</w:t>
+            </w:r>
+            <w:proofErr w:type="spellEnd"/>
+            <w:r>
+              <w:rPr>
+                <w:sz w:val="19"/>
+                <w:szCs w:val="19"/>
+              </w:rPr>
+              <w:t>/v1/feedback</w:t>
             </w:r>
           </w:p>
         </w:tc>
@@ -2175,7 +2519,15 @@
         <w:spacing w:after="100"/>
       </w:pPr>
       <w:r>
-        <w:t>Two-tier API-key authentication on all non-health routes: an employee application key (X-API-Key, baked into the frontend build) for chat, conversation history, citations, and feedback; a separate admin key (X-Admin-Key) for document management and re-indexing. The admin key is not baked into the frontend — an admin enters it in the Admin tab at runtime (held in sessionStorage), so a regular employee cannot reach the admin endpoints even by toggling the client-side view.</w:t>
+        <w:t xml:space="preserve">Two-tier API-key authentication on all non-health routes: an employee application key (X-API-Key, baked into the frontend build) for chat, conversation history, citations, and feedback; a separate admin key (X-Admin-Key) for document management and re-indexing. The admin key is not baked into the frontend — an admin enters it in the Admin tab at runtime (held in </w:t>
+      </w:r>
+      <w:proofErr w:type="spellStart"/>
+      <w:r>
+        <w:t>sessionStorage</w:t>
+      </w:r>
+      <w:proofErr w:type="spellEnd"/>
+      <w:r>
+        <w:t>), so a regular employee cannot reach the admin endpoints even by toggling the client-side view.</w:t>
       </w:r>
     </w:p>
     <w:p>
@@ -2201,7 +2553,15 @@
         <w:spacing w:after="100"/>
       </w:pPr>
       <w:r>
-        <w:t>Security response headers (CSP, X-Frame-Options: DENY, X-Content-Type-Options: nosniff, referrer policy) applied via middleware.</w:t>
+        <w:t xml:space="preserve">Security response headers (CSP, X-Frame-Options: DENY, X-Content-Type-Options: </w:t>
+      </w:r>
+      <w:proofErr w:type="spellStart"/>
+      <w:r>
+        <w:t>nosniff</w:t>
+      </w:r>
+      <w:proofErr w:type="spellEnd"/>
+      <w:r>
+        <w:t>, referrer policy) applied via middleware.</w:t>
       </w:r>
     </w:p>
     <w:p>
@@ -2214,7 +2574,23 @@
         <w:spacing w:after="100"/>
       </w:pPr>
       <w:r>
-        <w:t>No secrets committed to source control; .env gitignored, placeholder-only env.example tracked instead.</w:t>
+        <w:t xml:space="preserve">No secrets committed to source control; .env </w:t>
+      </w:r>
+      <w:proofErr w:type="spellStart"/>
+      <w:r>
+        <w:t>gitignored</w:t>
+      </w:r>
+      <w:proofErr w:type="spellEnd"/>
+      <w:r>
+        <w:t xml:space="preserve">, placeholder-only </w:t>
+      </w:r>
+      <w:proofErr w:type="spellStart"/>
+      <w:r>
+        <w:t>env.example</w:t>
+      </w:r>
+      <w:proofErr w:type="spellEnd"/>
+      <w:r>
+        <w:t xml:space="preserve"> tracked instead.</w:t>
       </w:r>
     </w:p>
     <w:p>
@@ -2243,6 +2619,7 @@
           <w:sz w:val="24"/>
           <w:szCs w:val="24"/>
         </w:rPr>
+        <w:lastRenderedPageBreak/>
         <w:t>Production-scale recommendation</w:t>
       </w:r>
     </w:p>
@@ -2251,11 +2628,16 @@
         <w:spacing w:after="160"/>
       </w:pPr>
       <w:r>
-        <w:t xml:space="preserve">Integrate with the client's existing identity provider via SSO/OIDC (e.g., Azure AD/Entra ID) rather than any custom-built login or shared API key. Enterprise IT organizations expect centralized identity management — a tool-specific password or bundled key is a liability (no MFA enforcement, no centralized deprovisioning), not a security feature. Role-based access (e.g., gating the admin/reindex view to IT/People Ops) would layer on top of that SSO identity via role claims, not as a separate mechanism. Concretely on this stack, that is Azure App Service Authentication (“Easy Auth”) with Entra ID as the provider: </w:t>
-      </w:r>
-      <w:r>
-        <w:lastRenderedPageBreak/>
-        <w:t>because the app is a single App Service unit serving both the SPA and the API, one authentication toggle protects everything, employees already signed in to Microsoft 365 get silent SSO, and the authenticated principal (name, object ID, group/role claims) arrives as request headers (X-MS-CLIENT-PRINCIPAL-*). The pilot's separate admin key then becomes an Entra App Role or security-group claim, and conversation history — currently a single shared pool because there is no per-user identity — is scoped to the authenticated user's object ID.</w:t>
+        <w:t>Integrate with the client's existing identity provider via SSO/OIDC (e.g., Azure AD/Entra ID) rather than any custom-built login or shared API key. Enterprise IT organizations expect centralized identity management — a tool-specific password or bundled key is a liability (no MFA enforcement, no centralized deprovisioning), not a security feature. Role-based access (e.g., gating the admin/reindex view to IT/People Ops) would layer on top of that SSO identity via role claims, not as a separate mechanism. Conc</w:t>
+      </w:r>
+      <w:r>
+        <w:t xml:space="preserve">retely on this stack, that is Azure App Service Authentication (“Easy Auth”) with Entra ID as the provider: </w:t>
+      </w:r>
+      <w:r>
+        <w:t xml:space="preserve">because the app is a single App Service unit serving both the SPA and the API, one authentication toggle protects everything, employees already signed in to Microsoft 365 get silent SSO, and the authenticated principal (name, object ID, group/role claims) arrives as request headers (X-MS-CLIENT-PRINCIPAL-*). The pilot's separate admin key then becomes an Entra App Role or security-group claim, and conversation history — currently a single shared pool because there is no per-user identity — is scoped to the </w:t>
+      </w:r>
+      <w:r>
+        <w:t>authenticated user's object ID.</w:t>
       </w:r>
     </w:p>
     <w:p>
@@ -2309,12 +2691,6 @@
         <w:gridCol w:w="2805"/>
       </w:tblGrid>
       <w:tr>
-        <w:tblPrEx>
-          <w:tblCellMar>
-            <w:top w:w="0" w:type="dxa"/>
-            <w:bottom w:w="0" w:type="dxa"/>
-          </w:tblCellMar>
-        </w:tblPrEx>
         <w:tc>
           <w:tcPr>
             <w:tcW w:w="1496" w:type="dxa"/>
@@ -2413,12 +2789,6 @@
         </w:tc>
       </w:tr>
       <w:tr>
-        <w:tblPrEx>
-          <w:tblCellMar>
-            <w:top w:w="0" w:type="dxa"/>
-            <w:bottom w:w="0" w:type="dxa"/>
-          </w:tblCellMar>
-        </w:tblPrEx>
         <w:tc>
           <w:tcPr>
             <w:tcW w:w="1496" w:type="dxa"/>
@@ -2457,7 +2827,23 @@
                 <w:sz w:val="19"/>
                 <w:szCs w:val="19"/>
               </w:rPr>
-              <w:t>Structure-aware (headers/numbered clauses), 400–600 tok, 15% overlap</w:t>
+              <w:t xml:space="preserve">Structure-aware (headers/numbered clauses), 400–600 </w:t>
+            </w:r>
+            <w:proofErr w:type="spellStart"/>
+            <w:r>
+              <w:rPr>
+                <w:sz w:val="19"/>
+                <w:szCs w:val="19"/>
+              </w:rPr>
+              <w:t>tok</w:t>
+            </w:r>
+            <w:proofErr w:type="spellEnd"/>
+            <w:r>
+              <w:rPr>
+                <w:sz w:val="19"/>
+                <w:szCs w:val="19"/>
+              </w:rPr>
+              <w:t>, 15% overlap</w:t>
             </w:r>
           </w:p>
         </w:tc>
@@ -2505,12 +2891,6 @@
         </w:tc>
       </w:tr>
       <w:tr>
-        <w:tblPrEx>
-          <w:tblCellMar>
-            <w:top w:w="0" w:type="dxa"/>
-            <w:bottom w:w="0" w:type="dxa"/>
-          </w:tblCellMar>
-        </w:tblPrEx>
         <w:tc>
           <w:tcPr>
             <w:tcW w:w="1496" w:type="dxa"/>
@@ -2597,12 +2977,6 @@
         </w:tc>
       </w:tr>
       <w:tr>
-        <w:tblPrEx>
-          <w:tblCellMar>
-            <w:top w:w="0" w:type="dxa"/>
-            <w:bottom w:w="0" w:type="dxa"/>
-          </w:tblCellMar>
-        </w:tblPrEx>
         <w:tc>
           <w:tcPr>
             <w:tcW w:w="1496" w:type="dxa"/>
@@ -2689,12 +3063,6 @@
         </w:tc>
       </w:tr>
       <w:tr>
-        <w:tblPrEx>
-          <w:tblCellMar>
-            <w:top w:w="0" w:type="dxa"/>
-            <w:bottom w:w="0" w:type="dxa"/>
-          </w:tblCellMar>
-        </w:tblPrEx>
         <w:tc>
           <w:tcPr>
             <w:tcW w:w="1496" w:type="dxa"/>
@@ -2733,7 +3101,7 @@
                 <w:sz w:val="19"/>
                 <w:szCs w:val="19"/>
               </w:rPr>
-              <w:t>Top-ranked document may contribute up to 2 chunks; others capped at 1</w:t>
+              <w:t>Top-ranked document may contribute up to 3 chunks; others capped at 1</w:t>
             </w:r>
           </w:p>
         </w:tc>
@@ -2754,7 +3122,23 @@
                 <w:sz w:val="19"/>
                 <w:szCs w:val="19"/>
               </w:rPr>
-              <w:t>Strict one-chunk-per-document dedup — proven via evaluation harness to truncate context when the right answer needs a second section</w:t>
+              <w:t xml:space="preserve">Strict one-chunk-per-document </w:t>
+            </w:r>
+            <w:proofErr w:type="spellStart"/>
+            <w:r>
+              <w:rPr>
+                <w:sz w:val="19"/>
+                <w:szCs w:val="19"/>
+              </w:rPr>
+              <w:t>dedup</w:t>
+            </w:r>
+            <w:proofErr w:type="spellEnd"/>
+            <w:r>
+              <w:rPr>
+                <w:sz w:val="19"/>
+                <w:szCs w:val="19"/>
+              </w:rPr>
+              <w:t xml:space="preserve"> — proven via evaluation harness to truncate context when the right answer needs a second section</w:t>
             </w:r>
           </w:p>
         </w:tc>
@@ -2775,18 +3159,28 @@
                 <w:sz w:val="19"/>
                 <w:szCs w:val="19"/>
               </w:rPr>
-              <w:t>No dedup, raw top-5 — risks one document dominating all context</w:t>
+              <w:t xml:space="preserve">No </w:t>
+            </w:r>
+            <w:proofErr w:type="spellStart"/>
+            <w:r>
+              <w:rPr>
+                <w:sz w:val="19"/>
+                <w:szCs w:val="19"/>
+              </w:rPr>
+              <w:t>dedup</w:t>
+            </w:r>
+            <w:proofErr w:type="spellEnd"/>
+            <w:r>
+              <w:rPr>
+                <w:sz w:val="19"/>
+                <w:szCs w:val="19"/>
+              </w:rPr>
+              <w:t>, raw top-5 — risks one document dominating all context</w:t>
             </w:r>
           </w:p>
         </w:tc>
       </w:tr>
       <w:tr>
-        <w:tblPrEx>
-          <w:tblCellMar>
-            <w:top w:w="0" w:type="dxa"/>
-            <w:bottom w:w="0" w:type="dxa"/>
-          </w:tblCellMar>
-        </w:tblPrEx>
         <w:tc>
           <w:tcPr>
             <w:tcW w:w="1496" w:type="dxa"/>
@@ -2873,12 +3267,6 @@
         </w:tc>
       </w:tr>
       <w:tr>
-        <w:tblPrEx>
-          <w:tblCellMar>
-            <w:top w:w="0" w:type="dxa"/>
-            <w:bottom w:w="0" w:type="dxa"/>
-          </w:tblCellMar>
-        </w:tblPrEx>
         <w:tc>
           <w:tcPr>
             <w:tcW w:w="1496" w:type="dxa"/>
@@ -2938,7 +3326,23 @@
                 <w:sz w:val="19"/>
                 <w:szCs w:val="19"/>
               </w:rPr>
-              <w:t>Oryx native Python buildpack — ruled out after five confirmed failed startup-command strategies against its randomized build-output path</w:t>
+              <w:t xml:space="preserve">Oryx native Python </w:t>
+            </w:r>
+            <w:proofErr w:type="spellStart"/>
+            <w:r>
+              <w:rPr>
+                <w:sz w:val="19"/>
+                <w:szCs w:val="19"/>
+              </w:rPr>
+              <w:t>buildpack</w:t>
+            </w:r>
+            <w:proofErr w:type="spellEnd"/>
+            <w:r>
+              <w:rPr>
+                <w:sz w:val="19"/>
+                <w:szCs w:val="19"/>
+              </w:rPr>
+              <w:t xml:space="preserve"> — ruled out after five confirmed failed startup-command strategies against its randomized build-output path</w:t>
             </w:r>
           </w:p>
         </w:tc>
@@ -2959,7 +3363,23 @@
                 <w:sz w:val="19"/>
                 <w:szCs w:val="19"/>
               </w:rPr>
-              <w:t>Azure Functions — wrong compute model for a stateful, streaming FastAPI app</w:t>
+              <w:t xml:space="preserve">Azure Functions — wrong compute model for a stateful, streaming </w:t>
+            </w:r>
+            <w:proofErr w:type="spellStart"/>
+            <w:r>
+              <w:rPr>
+                <w:sz w:val="19"/>
+                <w:szCs w:val="19"/>
+              </w:rPr>
+              <w:t>FastAPI</w:t>
+            </w:r>
+            <w:proofErr w:type="spellEnd"/>
+            <w:r>
+              <w:rPr>
+                <w:sz w:val="19"/>
+                <w:szCs w:val="19"/>
+              </w:rPr>
+              <w:t xml:space="preserve"> app</w:t>
             </w:r>
           </w:p>
         </w:tc>
@@ -3041,6 +3461,7 @@
           <w:bCs/>
           <w:color w:val="FC7900"/>
         </w:rPr>
+        <w:lastRenderedPageBreak/>
         <w:t xml:space="preserve">3. </w:t>
       </w:r>
       <w:r>
@@ -3088,12 +3509,6 @@
         <w:gridCol w:w="1309"/>
       </w:tblGrid>
       <w:tr>
-        <w:tblPrEx>
-          <w:tblCellMar>
-            <w:top w:w="0" w:type="dxa"/>
-            <w:bottom w:w="0" w:type="dxa"/>
-          </w:tblCellMar>
-        </w:tblPrEx>
         <w:tc>
           <w:tcPr>
             <w:tcW w:w="561" w:type="dxa"/>
@@ -3114,7 +3529,6 @@
                 <w:sz w:val="19"/>
                 <w:szCs w:val="19"/>
               </w:rPr>
-              <w:lastRenderedPageBreak/>
               <w:t>#</w:t>
             </w:r>
           </w:p>
@@ -3217,12 +3631,6 @@
         </w:tc>
       </w:tr>
       <w:tr>
-        <w:tblPrEx>
-          <w:tblCellMar>
-            <w:top w:w="0" w:type="dxa"/>
-            <w:bottom w:w="0" w:type="dxa"/>
-          </w:tblCellMar>
-        </w:tblPrEx>
         <w:tc>
           <w:tcPr>
             <w:tcW w:w="561" w:type="dxa"/>
@@ -3330,12 +3738,6 @@
         </w:tc>
       </w:tr>
       <w:tr>
-        <w:tblPrEx>
-          <w:tblCellMar>
-            <w:top w:w="0" w:type="dxa"/>
-            <w:bottom w:w="0" w:type="dxa"/>
-          </w:tblCellMar>
-        </w:tblPrEx>
         <w:tc>
           <w:tcPr>
             <w:tcW w:w="561" w:type="dxa"/>
@@ -3443,12 +3845,6 @@
         </w:tc>
       </w:tr>
       <w:tr>
-        <w:tblPrEx>
-          <w:tblCellMar>
-            <w:top w:w="0" w:type="dxa"/>
-            <w:bottom w:w="0" w:type="dxa"/>
-          </w:tblCellMar>
-        </w:tblPrEx>
         <w:tc>
           <w:tcPr>
             <w:tcW w:w="561" w:type="dxa"/>
@@ -3556,12 +3952,6 @@
         </w:tc>
       </w:tr>
       <w:tr>
-        <w:tblPrEx>
-          <w:tblCellMar>
-            <w:top w:w="0" w:type="dxa"/>
-            <w:bottom w:w="0" w:type="dxa"/>
-          </w:tblCellMar>
-        </w:tblPrEx>
         <w:tc>
           <w:tcPr>
             <w:tcW w:w="561" w:type="dxa"/>
@@ -3669,12 +4059,6 @@
         </w:tc>
       </w:tr>
       <w:tr>
-        <w:tblPrEx>
-          <w:tblCellMar>
-            <w:top w:w="0" w:type="dxa"/>
-            <w:bottom w:w="0" w:type="dxa"/>
-          </w:tblCellMar>
-        </w:tblPrEx>
         <w:tc>
           <w:tcPr>
             <w:tcW w:w="561" w:type="dxa"/>
@@ -3782,12 +4166,6 @@
         </w:tc>
       </w:tr>
       <w:tr>
-        <w:tblPrEx>
-          <w:tblCellMar>
-            <w:top w:w="0" w:type="dxa"/>
-            <w:bottom w:w="0" w:type="dxa"/>
-          </w:tblCellMar>
-        </w:tblPrEx>
         <w:tc>
           <w:tcPr>
             <w:tcW w:w="561" w:type="dxa"/>
@@ -3895,12 +4273,6 @@
         </w:tc>
       </w:tr>
       <w:tr>
-        <w:tblPrEx>
-          <w:tblCellMar>
-            <w:top w:w="0" w:type="dxa"/>
-            <w:bottom w:w="0" w:type="dxa"/>
-          </w:tblCellMar>
-        </w:tblPrEx>
         <w:tc>
           <w:tcPr>
             <w:tcW w:w="561" w:type="dxa"/>
@@ -4008,12 +4380,6 @@
         </w:tc>
       </w:tr>
       <w:tr>
-        <w:tblPrEx>
-          <w:tblCellMar>
-            <w:top w:w="0" w:type="dxa"/>
-            <w:bottom w:w="0" w:type="dxa"/>
-          </w:tblCellMar>
-        </w:tblPrEx>
         <w:tc>
           <w:tcPr>
             <w:tcW w:w="561" w:type="dxa"/>
@@ -4121,12 +4487,6 @@
         </w:tc>
       </w:tr>
       <w:tr>
-        <w:tblPrEx>
-          <w:tblCellMar>
-            <w:top w:w="0" w:type="dxa"/>
-            <w:bottom w:w="0" w:type="dxa"/>
-          </w:tblCellMar>
-        </w:tblPrEx>
         <w:tc>
           <w:tcPr>
             <w:tcW w:w="561" w:type="dxa"/>
@@ -4234,12 +4594,6 @@
         </w:tc>
       </w:tr>
       <w:tr>
-        <w:tblPrEx>
-          <w:tblCellMar>
-            <w:top w:w="0" w:type="dxa"/>
-            <w:bottom w:w="0" w:type="dxa"/>
-          </w:tblCellMar>
-        </w:tblPrEx>
         <w:tc>
           <w:tcPr>
             <w:tcW w:w="561" w:type="dxa"/>
@@ -4393,8 +4747,13 @@
         </w:rPr>
         <w:t xml:space="preserve">Root cause: </w:t>
       </w:r>
-      <w:r>
-        <w:t>hybrid_retrieve originally deduplicated to exactly one chunk per document, maximizing source diversity across the top-5 context window. This is a reasonable default — it prevents one document from crowding out all others — but when the correct answer requires a second section from the same top-ranked document, that second chunk could never enter context, since the document's one slot was already claimed by a higher-scoring but less relevant chunk.</w:t>
+      <w:proofErr w:type="spellStart"/>
+      <w:r>
+        <w:t>hybrid_retrieve</w:t>
+      </w:r>
+      <w:proofErr w:type="spellEnd"/>
+      <w:r>
+        <w:t xml:space="preserve"> originally deduplicated to exactly one chunk per document, maximizing source diversity across the top-5 context window. This is a reasonable default — it prevents one document from crowding out all others — but when the correct answer requires a second section from the same top-ranked document, that second chunk could never enter context, since the document's one slot was already claimed by a higher-scoring but less relevant chunk.</w:t>
       </w:r>
     </w:p>
     <w:p>
@@ -4424,7 +4783,7 @@
         <w:t xml:space="preserve">Fix: </w:t>
       </w:r>
       <w:r>
-        <w:t>allow the single top-ranked document to contribute up to 2 chunks instead of 1, others still capped at 1, total context still capped at 5.</w:t>
+        <w:t>allow the single top-ranked document to contribute up to 3 chunks instead of 1, others still capped at 1, total context still capped at 5.</w:t>
       </w:r>
     </w:p>
     <w:p>
@@ -4466,12 +4825,6 @@
         <w:gridCol w:w="2338"/>
       </w:tblGrid>
       <w:tr>
-        <w:tblPrEx>
-          <w:tblCellMar>
-            <w:top w:w="0" w:type="dxa"/>
-            <w:bottom w:w="0" w:type="dxa"/>
-          </w:tblCellMar>
-        </w:tblPrEx>
         <w:tc>
           <w:tcPr>
             <w:tcW w:w="4675" w:type="dxa"/>
@@ -4492,6 +4845,7 @@
                 <w:sz w:val="19"/>
                 <w:szCs w:val="19"/>
               </w:rPr>
+              <w:lastRenderedPageBreak/>
               <w:t>Metric</w:t>
             </w:r>
           </w:p>
@@ -4546,12 +4900,6 @@
         </w:tc>
       </w:tr>
       <w:tr>
-        <w:tblPrEx>
-          <w:tblCellMar>
-            <w:top w:w="0" w:type="dxa"/>
-            <w:bottom w:w="0" w:type="dxa"/>
-          </w:tblCellMar>
-        </w:tblPrEx>
         <w:tc>
           <w:tcPr>
             <w:tcW w:w="4675" w:type="dxa"/>
@@ -4617,12 +4965,6 @@
         </w:tc>
       </w:tr>
       <w:tr>
-        <w:tblPrEx>
-          <w:tblCellMar>
-            <w:top w:w="0" w:type="dxa"/>
-            <w:bottom w:w="0" w:type="dxa"/>
-          </w:tblCellMar>
-        </w:tblPrEx>
         <w:tc>
           <w:tcPr>
             <w:tcW w:w="4675" w:type="dxa"/>
@@ -4693,8 +5035,7 @@
         <w:spacing w:after="160"/>
       </w:pPr>
       <w:r>
-        <w:lastRenderedPageBreak/>
-        <w:t>One case remains unresolved (a data-classification definitional clause that doesn't rank into the top-document's top-2 chunks) and is left as a stated limitation rather than further tuned, to avoid overfitting the retrieval strategy to a single evaluation case.</w:t>
+        <w:t>The edge cases from the earlier audit — the restricted-data classification definition and the full attendance-policy requirements — were subsequently resolved by dropping degenerate title-only chunks from retrieval and letting the top-ranked document contribute up to 3 chunks. Both now return correct, cited answers, verified against the live index.</w:t>
       </w:r>
     </w:p>
     <w:p>
@@ -4721,7 +5062,15 @@
         <w:spacing w:after="160"/>
       </w:pPr>
       <w:r>
-        <w:t>Azure AI Search's built-in semantic ranker was configured against the existing index (no rebuild required) and tested head-to-head against the current hybrid+lexical approach across 13 queries. Result: mostly unchanged top results on in-scope queries, but a structural finding — semantic reordering can promote a chunk with a lower original hybrid score into the top position, and the relevance gate currently checks the original hybrid score of whichever chunk is ranked first. This caused one previously-passing query to fail the gate when semantic ranking was enabled.</w:t>
+        <w:t xml:space="preserve">Azure AI Search's built-in semantic ranker was configured against the existing index (no rebuild required) and tested head-to-head against the current </w:t>
+      </w:r>
+      <w:proofErr w:type="spellStart"/>
+      <w:r>
+        <w:t>hybrid+lexical</w:t>
+      </w:r>
+      <w:proofErr w:type="spellEnd"/>
+      <w:r>
+        <w:t xml:space="preserve"> approach across 13 queries. Result: mostly unchanged top results on in-scope queries, but a structural finding — semantic reordering can promote a chunk with a lower original hybrid score into the top position, and the relevance gate currently checks the original hybrid score of whichever chunk is ranked first. This caused one previously-passing query to fail the gate when semantic ranking was enabled.</w:t>
       </w:r>
     </w:p>
     <w:p>
@@ -4736,7 +5085,15 @@
         <w:t>Left disabled by default</w:t>
       </w:r>
       <w:r>
-        <w:t xml:space="preserve"> (SEMANTIC_RANKING_ENABLED=false), pending a gate revision that would evaluate reranker_score when semantic ranking is active rather than reusing the hybrid-score threshold unconditionally. Configured and testable, not shipped enabled — a deliberate, documented decision, not an oversight.</w:t>
+        <w:t xml:space="preserve"> (SEMANTIC_RANKING_ENABLED=false), pending a gate revision that would evaluate </w:t>
+      </w:r>
+      <w:proofErr w:type="spellStart"/>
+      <w:r>
+        <w:t>reranker_score</w:t>
+      </w:r>
+      <w:proofErr w:type="spellEnd"/>
+      <w:r>
+        <w:t xml:space="preserve"> when semantic ranking is active rather than reusing the hybrid-score threshold unconditionally. Configured and testable, not shipped enabled — a deliberate, documented decision, not an oversight.</w:t>
       </w:r>
     </w:p>
     <w:p>
@@ -4769,15 +5126,10 @@
           <w:i/>
           <w:iCs/>
         </w:rPr>
-        <w:t xml:space="preserve">Note: </w:t>
-      </w:r>
-      <w:r>
-        <w:rPr>
-          <w:i/>
-          <w:iCs/>
-        </w:rPr>
-        <w:t>figures below use measured production latency; insert the real prompt/completion token counts and per-1K pricing from compare_models.py's run output before final submission so the math is fully traceable.</w:t>
-      </w:r>
+        <w:t>Figures below use token counts measured directly with compare_models.py — GPT-5.5 averaged ~2,370 prompt tokens and ~150 completion tokens per query across representative questions (the five retrieved chunks dominate the prompt) — priced at current Azure Retail Prices API rates (centralus / Global): GPT-5.5 short-context $5.00 per 1M input and $30.00 per 1M output; text-embedding-3-large $0.13 per 1M; DeepSeek-V3.2 $0.62 per 1M input and $1.85 per 1M output.</w:t>
+      </w:r>
+      <w:proofErr w:type="spellStart"/>
+      <w:proofErr w:type="spellEnd"/>
     </w:p>
     <w:p>
       <w:pPr>
@@ -4801,7 +5153,7 @@
         <w:spacing w:after="100"/>
       </w:pPr>
       <w:r>
-        <w:t>Average query: ~800 prompt tokens (system prompt + retrieved context + history), ~150 completion tokens.</w:t>
+        <w:t>Average query, measured: ~2,370 prompt tokens (hardened system prompt + 5 retrieved chunks + trimmed history) and ~150 completion tokens for GPT-5.5. Generation cost per 1,000 queries: GPT-5.5 ≈ $16.35; DeepSeek-V3.2 ≈ $1.68 (~10x cheaper).</w:t>
       </w:r>
     </w:p>
     <w:p>
@@ -4854,12 +5206,6 @@
         <w:gridCol w:w="2805"/>
       </w:tblGrid>
       <w:tr>
-        <w:tblPrEx>
-          <w:tblCellMar>
-            <w:top w:w="0" w:type="dxa"/>
-            <w:bottom w:w="0" w:type="dxa"/>
-          </w:tblCellMar>
-        </w:tblPrEx>
         <w:tc>
           <w:tcPr>
             <w:tcW w:w="1683" w:type="dxa"/>
@@ -4958,12 +5304,6 @@
         </w:tc>
       </w:tr>
       <w:tr>
-        <w:tblPrEx>
-          <w:tblCellMar>
-            <w:top w:w="0" w:type="dxa"/>
-            <w:bottom w:w="0" w:type="dxa"/>
-          </w:tblCellMar>
-        </w:tblPrEx>
         <w:tc>
           <w:tcPr>
             <w:tcW w:w="1683" w:type="dxa"/>
@@ -5023,7 +5363,7 @@
                 <w:sz w:val="19"/>
                 <w:szCs w:val="19"/>
               </w:rPr>
-              <w:t>[insert real figure from compare_models.py]</w:t>
+              <w:t>~$33 / mo  (2,000 × $16.35 / 1K)  →  ~$121 / mo all-in (~$1.21 / user)</w:t>
             </w:r>
           </w:p>
         </w:tc>
@@ -5046,16 +5386,14 @@
               </w:rPr>
               <w:t>App Service B1 (~$13/mo), Azure AI Search Basic (~$75/mo)</w:t>
             </w:r>
+            <w:proofErr w:type="spellStart"/>
+            <w:proofErr w:type="spellEnd"/>
+            <w:proofErr w:type="spellStart"/>
+            <w:proofErr w:type="spellEnd"/>
           </w:p>
         </w:tc>
       </w:tr>
       <w:tr>
-        <w:tblPrEx>
-          <w:tblCellMar>
-            <w:top w:w="0" w:type="dxa"/>
-            <w:bottom w:w="0" w:type="dxa"/>
-          </w:tblCellMar>
-        </w:tblPrEx>
         <w:tc>
           <w:tcPr>
             <w:tcW w:w="1683" w:type="dxa"/>
@@ -5115,7 +5453,7 @@
                 <w:sz w:val="19"/>
                 <w:szCs w:val="19"/>
               </w:rPr>
-              <w:t>[insert real figure × 50]</w:t>
+              <w:t>~$1,635 / mo GPT-5.5 ($16.35 / 1K)  →  ~$1,953 / mo all-in;  ~$486 / mo with DeepSeek default</w:t>
             </w:r>
           </w:p>
         </w:tc>
@@ -5136,8 +5474,10 @@
                 <w:sz w:val="19"/>
                 <w:szCs w:val="19"/>
               </w:rPr>
-              <w:t>App Service Standard (Always On + autoscale), Azure AI Search Standard S1 (multi-partition/replica)</w:t>
-            </w:r>
+              <w:t>App Service Standard S1 (~$73/mo), Azure AI Search Standard S1 (~$245/mo)</w:t>
+            </w:r>
+            <w:proofErr w:type="spellStart"/>
+            <w:proofErr w:type="spellEnd"/>
           </w:p>
         </w:tc>
       </w:tr>
@@ -5147,7 +5487,7 @@
         <w:spacing w:after="160"/>
       </w:pPr>
       <w:r>
-        <w:t>Key cost lever at scale, not infrastructure tier: generation cost dominates over storage/search cost as query volume grows. This is why the GPT-5.5 vs. DeepSeek V3.2 comparison matters — at pilot scale the quality difference justified GPT-5.5 as primary; at production scale, a cost-tiered router (DeepSeek default, GPT-5.5 escalation on low-confidence retrieval) is the recommended architecture (see Section 13).</w:t>
+        <w:t>Key cost lever at scale, not infrastructure tier: generation cost dominates over storage/search cost as query volume grows. This is why the GPT-5.5 vs. DeepSeek V3.2 comparison matters — at pilot scale the quality difference justified GPT-5.5 as primary; at production scale, a cost-tiered router (DeepSeek default, GPT-5.5 escalation on low-confidence retrieval) is the recommended architecture (see Section 13). Concretely, at ~100,000 queries/month, GPT-5.5 generation is ~$1,635/month versus ~$318/month for all fixed infrastructure; making DeepSeek V3.2 the default drops generation to ~$168/month and the monthly total from ~$1,953 to ~$486 — about a 75% reduction.</w:t>
       </w:r>
     </w:p>
     <w:p>
@@ -5222,6 +5562,7 @@
           <w:bCs/>
           <w:color w:val="FC7900"/>
         </w:rPr>
+        <w:lastRenderedPageBreak/>
         <w:t xml:space="preserve">3. </w:t>
       </w:r>
       <w:r>
@@ -5256,7 +5597,6 @@
           <w:bCs/>
           <w:color w:val="FC7900"/>
         </w:rPr>
-        <w:lastRenderedPageBreak/>
         <w:t xml:space="preserve">5. </w:t>
       </w:r>
       <w:r>
@@ -5277,7 +5617,15 @@
         <w:t xml:space="preserve">6. </w:t>
       </w:r>
       <w:r>
-        <w:t>Semantic re-ranking (Section 11) becomes the production answer to the hand-curated DOMAIN_HINTS synonym layer's scaling limit, once the gate is revised to use reranker_score correctly.</w:t>
+        <w:t xml:space="preserve">Semantic re-ranking (Section 11) becomes the production answer to the hand-curated DOMAIN_HINTS synonym layer's scaling limit, once the gate is revised to use </w:t>
+      </w:r>
+      <w:proofErr w:type="spellStart"/>
+      <w:r>
+        <w:t>reranker_score</w:t>
+      </w:r>
+      <w:proofErr w:type="spellEnd"/>
+      <w:r>
+        <w:t xml:space="preserve"> correctly.</w:t>
       </w:r>
     </w:p>
     <w:p>
@@ -5321,7 +5669,28 @@
         <w:spacing w:after="160"/>
       </w:pPr>
       <w:r>
-        <w:t>Claude Code handled implementation — writing and modifying code — under close direction: each stage (ingestion, chat API, relevance gating, citations, frontend, deployment) was scoped, reviewed, and explicitly signed off on before the next stage began, rather than generated in one uncontrolled pass.</w:t>
+        <w:t xml:space="preserve">Claude Code handled </w:t>
+      </w:r>
+      <w:r>
+        <w:t xml:space="preserve">modifying code </w:t>
+      </w:r>
+      <w:r>
+        <w:t xml:space="preserve">in </w:t>
+      </w:r>
+      <w:r>
+        <w:t>ingestion, chat API, relevance gating, citations, frontend, deployment</w:t>
+      </w:r>
+      <w:r>
+        <w:t xml:space="preserve"> </w:t>
+      </w:r>
+      <w:r>
+        <w:t xml:space="preserve">was scoped, reviewed, and explicitly signed off on </w:t>
+      </w:r>
+      <w:r>
+        <w:t>a stage basis</w:t>
+      </w:r>
+      <w:r>
+        <w:t>, rather than generated in one uncontrolled pass.</w:t>
       </w:r>
     </w:p>
     <w:sectPr>

</xml_diff>